<commit_message>
Revert "Count the manure management system split as activity data"
This reverts 825b10b. Not because the reading was wrong: IPCC Vol.4
Ch.10.4.4 and Ch.10.5.5 do file manure management system usage under
activity data, and that finding stands. It is reverted because the
change alters the AD/EF split that every past run reported, and it
narrows an audit check written to enforce a reviewer's decision. That
belongs in a review, not in a same-day commit.

The analysis, the evidence, the measured effect and what a future
implementation has to touch are written up in knowledge/13-open-items.md
so nothing has to be rediscovered.

Co-Authored-By: Claude Opus 5 (1M context) <noreply@anthropic.com>
</commit_message>
<xml_diff>
--- a/www/getting_started.docx
+++ b/www/getting_started.docx
@@ -3377,13 +3377,13 @@
 </file>
 
 <file path=customXml/itemProps1.xml><?xml version="1.0" encoding="utf-8"?>
-<ds:datastoreItem xmlns:ds="http://schemas.openxmlformats.org/officeDocument/2006/customXml" ds:itemID="{A79956ED-976F-49A9-AA91-8BFA7E8FD827}"/>
+<ds:datastoreItem xmlns:ds="http://schemas.openxmlformats.org/officeDocument/2006/customXml" ds:itemID="{E35B2116-015B-4312-BF75-2A3931140882}"/>
 </file>
 
 <file path=customXml/itemProps2.xml><?xml version="1.0" encoding="utf-8"?>
-<ds:datastoreItem xmlns:ds="http://schemas.openxmlformats.org/officeDocument/2006/customXml" ds:itemID="{D7D7C790-207B-466E-88D8-37B3F52C8211}"/>
+<ds:datastoreItem xmlns:ds="http://schemas.openxmlformats.org/officeDocument/2006/customXml" ds:itemID="{EC7A890C-6555-4CE6-B0F1-0BDFB6BD9BE8}"/>
 </file>
 
 <file path=customXml/itemProps3.xml><?xml version="1.0" encoding="utf-8"?>
-<ds:datastoreItem xmlns:ds="http://schemas.openxmlformats.org/officeDocument/2006/customXml" ds:itemID="{8C85C50B-71B0-4F36-922A-E90AEC6E3C20}"/>
+<ds:datastoreItem xmlns:ds="http://schemas.openxmlformats.org/officeDocument/2006/customXml" ds:itemID="{CC1AB699-A662-43CA-9E41-DA163E2C81D8}"/>
 </file>
</xml_diff>